<commit_message>
Add distinctive character portraits and align teaching materials
</commit_message>
<xml_diff>
--- a/docs/worksheets/hanzo-roleplay.docx
+++ b/docs/worksheets/hanzo-roleplay.docx
@@ -4,34 +4,30 @@
   <w:body>
     <w:p>
       <w:pPr>
-        <w:spacing w:after="80" w:before="0" w:line="276" w:lineRule="auto"/>
-        <w:pBdr>
-          <w:bottom w:val="single" w:sz="8" w:color="000000"/>
-        </w:pBdr>
+        <w:pStyle w:val="Title"/>
+        <w:spacing w:after="40" w:before="0" w:line="276" w:lineRule="auto"/>
       </w:pPr>
       <w:r>
         <w:rPr>
           <w:rFonts w:ascii="UD Digi Kyokasho NK-B" w:hAnsi="UD Digi Kyokasho NK-B" w:eastAsia="UD Digi Kyokasho NK-B" w:cs="UD Digi Kyokasho NK-B"/>
           <w:b w:val="0"/>
-          <w:sz w:val="22"/>
+          <w:color w:val="000000"/>
+          <w:sz w:val="26"/>
         </w:rPr>
-        <w:t>【古典探究】『史記』「鴻門之会」　AIロールプレイ　授業プリント⑫</w:t>
+        <w:t>鴻門の会 范増として考える</w:t>
       </w:r>
+    </w:p>
+    <w:p>
+      <w:pPr>
+        <w:spacing w:after="100" w:before="0" w:line="276" w:lineRule="auto"/>
+      </w:pPr>
       <w:r>
         <w:rPr>
           <w:rFonts w:ascii="UD Digi Kyokasho NK-R" w:hAnsi="UD Digi Kyokasho NK-R" w:eastAsia="UD Digi Kyokasho NK-R" w:cs="UD Digi Kyokasho NK-R"/>
           <w:b w:val="0"/>
           <w:sz w:val="20"/>
         </w:rPr>
-        <w:t xml:space="preserve">　　二年　　　組　　　　番　氏名　　　　　　　　　　　　　　　　　　　</w:t>
-      </w:r>
-      <w:r>
-        <w:rPr>
-          <w:rFonts w:ascii="UD Digi Kyokasho NK-B" w:hAnsi="UD Digi Kyokasho NK-B" w:eastAsia="UD Digi Kyokasho NK-B" w:cs="UD Digi Kyokasho NK-B"/>
-          <w:b w:val="0"/>
-          <w:sz w:val="20"/>
-        </w:rPr>
-        <w:t>表</w:t>
+        <w:t>古典探究　AIロールプレイ　　年　　　組　　　番　氏名　　　　　　　　　　　　　　表</w:t>
       </w:r>
     </w:p>
     <w:tbl>
@@ -63,10 +59,9 @@
               <w:rPr>
                 <w:rFonts w:ascii="UD Digi Kyokasho NK-R" w:hAnsi="UD Digi Kyokasho NK-R" w:eastAsia="UD Digi Kyokasho NK-R" w:cs="UD Digi Kyokasho NK-R"/>
                 <w:b w:val="0"/>
-                <w:color w:val="5A4A2A"/>
                 <w:sz w:val="19"/>
               </w:rPr>
-              <w:t>高祖曰はく、「項羽は一の范増有れども用ゐる能はず。此れ其の我が擒と為る所以なり。」（高祖本紀）</w:t>
+              <w:t>場面は玉玦の合図に項王が応じなかった直後、剣舞が始まる前。追加の対話は創作です。</w:t>
             </w:r>
           </w:p>
           <w:p>
@@ -79,7 +74,7 @@
                 <w:b w:val="0"/>
                 <w:sz w:val="20"/>
               </w:rPr>
-              <w:t>――もし、あなたが范増だったら。樊噲が去り、沛公が「厠へ」と席を立った今が、最後の機会だ。AIが演じる項王を、本文を根拠にして説得しよう。言葉をかけられるのは五回まで。</w:t>
+              <w:t>あなたは范増です。本文を根拠に、項王が懸念を聞いて対応策を再検討できるよう進言しましょう。発言は五回まで。殺害や歴史の改変を成功条件にはしません。</w:t>
             </w:r>
           </w:p>
           <w:p>
@@ -92,7 +87,7 @@
                 <w:b w:val="0"/>
                 <w:sz w:val="21"/>
               </w:rPr>
-              <w:t>★Ⅰ．説得の根拠を本文から集めよう（書き下し文で書き抜く）</w:t>
+              <w:t>Ⅰ 本文から根拠を集める</w:t>
             </w:r>
           </w:p>
           <w:tbl>
@@ -129,7 +124,7 @@
                       <w:b w:val="0"/>
                       <w:sz w:val="18"/>
                     </w:rPr>
-                    <w:t>根拠（書き下し文）</w:t>
+                    <w:t>短い引用（原文か書き下し）</w:t>
                   </w:r>
                 </w:p>
               </w:tc>
@@ -148,7 +143,7 @@
                       <w:b w:val="0"/>
                       <w:sz w:val="18"/>
                     </w:rPr>
-                    <w:t>本文の場所</w:t>
+                    <w:t>段番号・頁行</w:t>
                   </w:r>
                 </w:p>
               </w:tc>
@@ -167,7 +162,7 @@
                       <w:b w:val="0"/>
                       <w:sz w:val="18"/>
                     </w:rPr>
-                    <w:t>項王に効きそうな理由</w:t>
+                    <w:t>引用から何を考えるか</w:t>
                   </w:r>
                 </w:p>
               </w:tc>
@@ -207,7 +202,7 @@
                       <w:b w:val="0"/>
                       <w:sz w:val="18"/>
                     </w:rPr>
-                    <w:t>P　 ・　 行</w:t>
+                    <w:t>g　 / P　 行</w:t>
                   </w:r>
                 </w:p>
               </w:tc>
@@ -264,7 +259,7 @@
                       <w:b w:val="0"/>
                       <w:sz w:val="18"/>
                     </w:rPr>
-                    <w:t>P　 ・　 行</w:t>
+                    <w:t>g　 / P　 行</w:t>
                   </w:r>
                 </w:p>
               </w:tc>
@@ -321,7 +316,7 @@
                       <w:b w:val="0"/>
                       <w:sz w:val="18"/>
                     </w:rPr>
-                    <w:t>P　 ・　 行</w:t>
+                    <w:t>g　 / P　 行</w:t>
                   </w:r>
                 </w:p>
               </w:tc>
@@ -378,7 +373,7 @@
                       <w:b w:val="0"/>
                       <w:sz w:val="18"/>
                     </w:rPr>
-                    <w:t>P　 ・　 行</w:t>
+                    <w:t>g　 / P　 行</w:t>
                   </w:r>
                 </w:p>
               </w:tc>
@@ -413,7 +408,7 @@
                 <w:color w:val="555555"/>
                 <w:sz w:val="17"/>
               </w:rPr>
-              <w:t>ヒント：范増の進言（気を望む）／曹無傷の密告／沛公が関中で財物を取らなかったこと／樊噲の振る舞い</w:t>
+              <w:t>資料の例：g01 密告／g02 范増の進言／g08 項伯の進言／g09 謝罪／g10 玉玦。剣舞以後の出来事はまだ起きていません。</w:t>
             </w:r>
           </w:p>
           <w:p>
@@ -426,7 +421,7 @@
                 <w:b w:val="0"/>
                 <w:sz w:val="21"/>
               </w:rPr>
-              <w:t>★Ⅱ．項王の人物像を押さえよう</w:t>
+              <w:t>Ⅱ 記述と解釈を区別する</w:t>
             </w:r>
           </w:p>
           <w:p>
@@ -439,7 +434,7 @@
                 <w:b w:val="0"/>
                 <w:sz w:val="19"/>
               </w:rPr>
-              <w:t>①　范増は項王を「君王人と為り（　　　　　）」と評した。</w:t>
+              <w:t>①　曹無傷の報告内容は、そのまま事実と言えるだろうか。</w:t>
             </w:r>
           </w:p>
           <w:p>
@@ -452,7 +447,7 @@
                 <w:b w:val="0"/>
                 <w:sz w:val="19"/>
               </w:rPr>
-              <w:t xml:space="preserve">　　→ 意味：（　　　　　　　　　　　　　　　　　　　　）</w:t>
+              <w:t xml:space="preserve">　　（　　　　　　　　　　　　　　　　　　　　　　　　）</w:t>
             </w:r>
           </w:p>
           <w:p>
@@ -465,7 +460,7 @@
                 <w:b w:val="0"/>
                 <w:sz w:val="19"/>
               </w:rPr>
-              <w:t>②　項伯の「今人大功有るに之を撃つは、（　　　）なり」に、項王は許諾した。</w:t>
+              <w:t>②　項王は項伯の進言にどう答えたか。（　　　　　　　　）</w:t>
             </w:r>
           </w:p>
           <w:p>
@@ -478,7 +473,7 @@
                 <w:b w:val="0"/>
                 <w:sz w:val="19"/>
               </w:rPr>
-              <w:t>③　だから項王を動かすには、「沛公を討っても（　　　）にならない」理由が要る。</w:t>
+              <w:t>③　「黙然不応」から推測できる心理を二つ挙げよう。</w:t>
             </w:r>
           </w:p>
           <w:p>
@@ -491,7 +486,7 @@
                 <w:b w:val="0"/>
                 <w:sz w:val="19"/>
               </w:rPr>
-              <w:t>④　言ってはいけないこと（項王が反発しそうな言い方）</w:t>
+              <w:t xml:space="preserve">　　推測は「解釈」、AIの追加の台詞は「創作」と区別する。</w:t>
             </w:r>
           </w:p>
           <w:tbl>
@@ -564,7 +559,7 @@
                 <w:b w:val="0"/>
                 <w:sz w:val="21"/>
               </w:rPr>
-              <w:t>★Ⅲ．対話の記録（言葉をかけられるのは五回まで）</w:t>
+              <w:t>Ⅲ 五回までの対話を記録する</w:t>
             </w:r>
           </w:p>
           <w:tbl>
@@ -1047,7 +1042,7 @@
                 <w:color w:val="555555"/>
                 <w:sz w:val="17"/>
               </w:rPr>
-              <w:t>※ 後の歴史（垓下など）を持ち出すと、項王は「妖言だ」と取り合わない。本文の範囲で勝負しよう。</w:t>
+              <w:t>資料付き指示文をアプリからコピー。引用には段番号を付け、資料にない引用をAIが作っていないか確認しよう。</w:t>
             </w:r>
           </w:p>
         </w:tc>
@@ -1060,34 +1055,30 @@
     </w:p>
     <w:p>
       <w:pPr>
-        <w:spacing w:after="80" w:before="0" w:line="276" w:lineRule="auto"/>
-        <w:pBdr>
-          <w:bottom w:val="single" w:sz="8" w:color="000000"/>
-        </w:pBdr>
+        <w:pStyle w:val="Title"/>
+        <w:spacing w:after="40" w:before="0" w:line="276" w:lineRule="auto"/>
       </w:pPr>
       <w:r>
         <w:rPr>
           <w:rFonts w:ascii="UD Digi Kyokasho NK-B" w:hAnsi="UD Digi Kyokasho NK-B" w:eastAsia="UD Digi Kyokasho NK-B" w:cs="UD Digi Kyokasho NK-B"/>
           <w:b w:val="0"/>
-          <w:sz w:val="22"/>
+          <w:color w:val="000000"/>
+          <w:sz w:val="26"/>
         </w:rPr>
-        <w:t>【古典探究】『史記』「鴻門之会」　AIロールプレイ　授業プリント⑫</w:t>
+        <w:t>鴻門の会 范増として考える</w:t>
       </w:r>
+    </w:p>
+    <w:p>
+      <w:pPr>
+        <w:spacing w:after="100" w:before="0" w:line="276" w:lineRule="auto"/>
+      </w:pPr>
       <w:r>
         <w:rPr>
           <w:rFonts w:ascii="UD Digi Kyokasho NK-R" w:hAnsi="UD Digi Kyokasho NK-R" w:eastAsia="UD Digi Kyokasho NK-R" w:cs="UD Digi Kyokasho NK-R"/>
           <w:b w:val="0"/>
           <w:sz w:val="20"/>
         </w:rPr>
-        <w:t xml:space="preserve">　　二年　　　組　　　　番　氏名　　　　　　　　　　　　　　　　　　　</w:t>
-      </w:r>
-      <w:r>
-        <w:rPr>
-          <w:rFonts w:ascii="UD Digi Kyokasho NK-B" w:hAnsi="UD Digi Kyokasho NK-B" w:eastAsia="UD Digi Kyokasho NK-B" w:cs="UD Digi Kyokasho NK-B"/>
-          <w:b w:val="0"/>
-          <w:sz w:val="20"/>
-        </w:rPr>
-        <w:t>裏</w:t>
+        <w:t>古典探究　AIロールプレイ　　年　　　組　　　番　氏名　　　　　　　　　　　　　　裏</w:t>
       </w:r>
     </w:p>
     <w:tbl>
@@ -1121,7 +1112,7 @@
                 <w:b w:val="0"/>
                 <w:sz w:val="21"/>
               </w:rPr>
-              <w:t>ⅰ　講評の「説得度」の推移を書き写そう（はじめ20、80以上で成功）</w:t>
+              <w:t>ⅰ AIの講評を本文と照合する</w:t>
             </w:r>
           </w:p>
           <w:tbl>
@@ -1138,18 +1129,14 @@
               </w:tblBorders>
             </w:tblPr>
             <w:tblGrid>
-              <w:gridCol w:w="1097"/>
-              <w:gridCol w:w="1097"/>
-              <w:gridCol w:w="1097"/>
-              <w:gridCol w:w="1097"/>
-              <w:gridCol w:w="1097"/>
-              <w:gridCol w:w="1097"/>
-              <w:gridCol w:w="1097"/>
+              <w:gridCol w:w="2561"/>
+              <w:gridCol w:w="2561"/>
+              <w:gridCol w:w="2561"/>
             </w:tblGrid>
             <w:tr>
               <w:tc>
                 <w:tcPr>
-                  <w:tcW w:type="dxa" w:w="1020"/>
+                  <w:tcW w:type="dxa" w:w="2835"/>
                   <w:shd w:val="clear" w:color="auto" w:fill="EDE7D6"/>
                 </w:tcPr>
                 <w:p>
@@ -1162,12 +1149,13 @@
                       <w:b w:val="0"/>
                       <w:sz w:val="18"/>
                     </w:rPr>
+                    <w:t>AIの引用や説明</w:t>
                   </w:r>
                 </w:p>
               </w:tc>
               <w:tc>
                 <w:tcPr>
-                  <w:tcW w:type="dxa" w:w="794"/>
+                  <w:tcW w:type="dxa" w:w="1417"/>
                   <w:shd w:val="clear" w:color="auto" w:fill="EDE7D6"/>
                 </w:tcPr>
                 <w:p>
@@ -1180,13 +1168,13 @@
                       <w:b w:val="0"/>
                       <w:sz w:val="18"/>
                     </w:rPr>
-                    <w:t>はじめ</w:t>
+                    <w:t>照合した段番号</w:t>
                   </w:r>
                 </w:p>
               </w:tc>
               <w:tc>
                 <w:tcPr>
-                  <w:tcW w:type="dxa" w:w="1077"/>
+                  <w:tcW w:type="dxa" w:w="3005"/>
                   <w:shd w:val="clear" w:color="auto" w:fill="EDE7D6"/>
                 </w:tcPr>
                 <w:p>
@@ -1199,83 +1187,7 @@
                       <w:b w:val="0"/>
                       <w:sz w:val="18"/>
                     </w:rPr>
-                    <w:t>１</w:t>
-                  </w:r>
-                </w:p>
-              </w:tc>
-              <w:tc>
-                <w:tcPr>
-                  <w:tcW w:type="dxa" w:w="1077"/>
-                  <w:shd w:val="clear" w:color="auto" w:fill="EDE7D6"/>
-                </w:tcPr>
-                <w:p>
-                  <w:pPr>
-                    <w:spacing w:after="0"/>
-                  </w:pPr>
-                  <w:r>
-                    <w:rPr>
-                      <w:rFonts w:ascii="UD Digi Kyokasho NK-B" w:hAnsi="UD Digi Kyokasho NK-B" w:eastAsia="UD Digi Kyokasho NK-B" w:cs="UD Digi Kyokasho NK-B"/>
-                      <w:b w:val="0"/>
-                      <w:sz w:val="18"/>
-                    </w:rPr>
-                    <w:t>２</w:t>
-                  </w:r>
-                </w:p>
-              </w:tc>
-              <w:tc>
-                <w:tcPr>
-                  <w:tcW w:type="dxa" w:w="1077"/>
-                  <w:shd w:val="clear" w:color="auto" w:fill="EDE7D6"/>
-                </w:tcPr>
-                <w:p>
-                  <w:pPr>
-                    <w:spacing w:after="0"/>
-                  </w:pPr>
-                  <w:r>
-                    <w:rPr>
-                      <w:rFonts w:ascii="UD Digi Kyokasho NK-B" w:hAnsi="UD Digi Kyokasho NK-B" w:eastAsia="UD Digi Kyokasho NK-B" w:cs="UD Digi Kyokasho NK-B"/>
-                      <w:b w:val="0"/>
-                      <w:sz w:val="18"/>
-                    </w:rPr>
-                    <w:t>３</w:t>
-                  </w:r>
-                </w:p>
-              </w:tc>
-              <w:tc>
-                <w:tcPr>
-                  <w:tcW w:type="dxa" w:w="1077"/>
-                  <w:shd w:val="clear" w:color="auto" w:fill="EDE7D6"/>
-                </w:tcPr>
-                <w:p>
-                  <w:pPr>
-                    <w:spacing w:after="0"/>
-                  </w:pPr>
-                  <w:r>
-                    <w:rPr>
-                      <w:rFonts w:ascii="UD Digi Kyokasho NK-B" w:hAnsi="UD Digi Kyokasho NK-B" w:eastAsia="UD Digi Kyokasho NK-B" w:cs="UD Digi Kyokasho NK-B"/>
-                      <w:b w:val="0"/>
-                      <w:sz w:val="18"/>
-                    </w:rPr>
-                    <w:t>４</w:t>
-                  </w:r>
-                </w:p>
-              </w:tc>
-              <w:tc>
-                <w:tcPr>
-                  <w:tcW w:type="dxa" w:w="1077"/>
-                  <w:shd w:val="clear" w:color="auto" w:fill="EDE7D6"/>
-                </w:tcPr>
-                <w:p>
-                  <w:pPr>
-                    <w:spacing w:after="0"/>
-                  </w:pPr>
-                  <w:r>
-                    <w:rPr>
-                      <w:rFonts w:ascii="UD Digi Kyokasho NK-B" w:hAnsi="UD Digi Kyokasho NK-B" w:eastAsia="UD Digi Kyokasho NK-B" w:cs="UD Digi Kyokasho NK-B"/>
-                      <w:b w:val="0"/>
-                      <w:sz w:val="18"/>
-                    </w:rPr>
-                    <w:t>５</w:t>
+                    <w:t>正しい点や修正する点</w:t>
                   </w:r>
                 </w:p>
               </w:tc>
@@ -1286,43 +1198,7 @@
               </w:trPr>
               <w:tc>
                 <w:tcPr>
-                  <w:tcW w:type="dxa" w:w="1020"/>
-                </w:tcPr>
-                <w:p>
-                  <w:pPr>
-                    <w:spacing w:after="0"/>
-                  </w:pPr>
-                  <w:r>
-                    <w:rPr>
-                      <w:rFonts w:ascii="UD Digi Kyokasho NK-R" w:hAnsi="UD Digi Kyokasho NK-R" w:eastAsia="UD Digi Kyokasho NK-R" w:cs="UD Digi Kyokasho NK-R"/>
-                      <w:b w:val="0"/>
-                      <w:sz w:val="18"/>
-                    </w:rPr>
-                    <w:t>説得度</w:t>
-                  </w:r>
-                </w:p>
-              </w:tc>
-              <w:tc>
-                <w:tcPr>
-                  <w:tcW w:type="dxa" w:w="794"/>
-                </w:tcPr>
-                <w:p>
-                  <w:pPr>
-                    <w:spacing w:after="0"/>
-                  </w:pPr>
-                  <w:r>
-                    <w:rPr>
-                      <w:rFonts w:ascii="UD Digi Kyokasho NK-R" w:hAnsi="UD Digi Kyokasho NK-R" w:eastAsia="UD Digi Kyokasho NK-R" w:cs="UD Digi Kyokasho NK-R"/>
-                      <w:b w:val="0"/>
-                      <w:sz w:val="18"/>
-                    </w:rPr>
-                    <w:t>２０</w:t>
-                  </w:r>
-                </w:p>
-              </w:tc>
-              <w:tc>
-                <w:tcPr>
-                  <w:tcW w:type="dxa" w:w="1077"/>
+                  <w:tcW w:type="dxa" w:w="2835"/>
                 </w:tcPr>
                 <w:p>
                   <w:pPr>
@@ -1339,7 +1215,7 @@
               </w:tc>
               <w:tc>
                 <w:tcPr>
-                  <w:tcW w:type="dxa" w:w="1077"/>
+                  <w:tcW w:type="dxa" w:w="1417"/>
                 </w:tcPr>
                 <w:p>
                   <w:pPr>
@@ -1356,41 +1232,7 @@
               </w:tc>
               <w:tc>
                 <w:tcPr>
-                  <w:tcW w:type="dxa" w:w="1077"/>
-                </w:tcPr>
-                <w:p>
-                  <w:pPr>
-                    <w:spacing w:after="0"/>
-                  </w:pPr>
-                  <w:r>
-                    <w:rPr>
-                      <w:rFonts w:ascii="UD Digi Kyokasho NK-R" w:hAnsi="UD Digi Kyokasho NK-R" w:eastAsia="UD Digi Kyokasho NK-R" w:cs="UD Digi Kyokasho NK-R"/>
-                      <w:b w:val="0"/>
-                      <w:sz w:val="18"/>
-                    </w:rPr>
-                  </w:r>
-                </w:p>
-              </w:tc>
-              <w:tc>
-                <w:tcPr>
-                  <w:tcW w:type="dxa" w:w="1077"/>
-                </w:tcPr>
-                <w:p>
-                  <w:pPr>
-                    <w:spacing w:after="0"/>
-                  </w:pPr>
-                  <w:r>
-                    <w:rPr>
-                      <w:rFonts w:ascii="UD Digi Kyokasho NK-R" w:hAnsi="UD Digi Kyokasho NK-R" w:eastAsia="UD Digi Kyokasho NK-R" w:cs="UD Digi Kyokasho NK-R"/>
-                      <w:b w:val="0"/>
-                      <w:sz w:val="18"/>
-                    </w:rPr>
-                  </w:r>
-                </w:p>
-              </w:tc>
-              <w:tc>
-                <w:tcPr>
-                  <w:tcW w:type="dxa" w:w="1077"/>
+                  <w:tcW w:type="dxa" w:w="3005"/>
                 </w:tcPr>
                 <w:p>
                   <w:pPr>
@@ -1412,27 +1254,7 @@
               </w:trPr>
               <w:tc>
                 <w:tcPr>
-                  <w:tcW w:type="dxa" w:w="1020"/>
-                </w:tcPr>
-                <w:p>
-                  <w:pPr>
-                    <w:spacing w:after="0"/>
-                  </w:pPr>
-                  <w:r>
-                    <w:rPr>
-                      <w:rFonts w:ascii="UD Digi Kyokasho NK-R" w:hAnsi="UD Digi Kyokasho NK-R" w:eastAsia="UD Digi Kyokasho NK-R" w:cs="UD Digi Kyokasho NK-R"/>
-                      <w:b w:val="0"/>
-                      <w:sz w:val="18"/>
-                    </w:rPr>
-                    <w:t>上下した</w:t>
-                    <w:br/>
-                    <w:t>理由</w:t>
-                  </w:r>
-                </w:p>
-              </w:tc>
-              <w:tc>
-                <w:tcPr>
-                  <w:tcW w:type="dxa" w:w="794"/>
+                  <w:tcW w:type="dxa" w:w="2835"/>
                 </w:tcPr>
                 <w:p>
                   <w:pPr>
@@ -1449,7 +1271,7 @@
               </w:tc>
               <w:tc>
                 <w:tcPr>
-                  <w:tcW w:type="dxa" w:w="1077"/>
+                  <w:tcW w:type="dxa" w:w="1417"/>
                 </w:tcPr>
                 <w:p>
                   <w:pPr>
@@ -1466,58 +1288,7 @@
               </w:tc>
               <w:tc>
                 <w:tcPr>
-                  <w:tcW w:type="dxa" w:w="1077"/>
-                </w:tcPr>
-                <w:p>
-                  <w:pPr>
-                    <w:spacing w:after="0"/>
-                  </w:pPr>
-                  <w:r>
-                    <w:rPr>
-                      <w:rFonts w:ascii="UD Digi Kyokasho NK-R" w:hAnsi="UD Digi Kyokasho NK-R" w:eastAsia="UD Digi Kyokasho NK-R" w:cs="UD Digi Kyokasho NK-R"/>
-                      <w:b w:val="0"/>
-                      <w:sz w:val="18"/>
-                    </w:rPr>
-                  </w:r>
-                </w:p>
-              </w:tc>
-              <w:tc>
-                <w:tcPr>
-                  <w:tcW w:type="dxa" w:w="1077"/>
-                </w:tcPr>
-                <w:p>
-                  <w:pPr>
-                    <w:spacing w:after="0"/>
-                  </w:pPr>
-                  <w:r>
-                    <w:rPr>
-                      <w:rFonts w:ascii="UD Digi Kyokasho NK-R" w:hAnsi="UD Digi Kyokasho NK-R" w:eastAsia="UD Digi Kyokasho NK-R" w:cs="UD Digi Kyokasho NK-R"/>
-                      <w:b w:val="0"/>
-                      <w:sz w:val="18"/>
-                    </w:rPr>
-                  </w:r>
-                </w:p>
-              </w:tc>
-              <w:tc>
-                <w:tcPr>
-                  <w:tcW w:type="dxa" w:w="1077"/>
-                </w:tcPr>
-                <w:p>
-                  <w:pPr>
-                    <w:spacing w:after="0"/>
-                  </w:pPr>
-                  <w:r>
-                    <w:rPr>
-                      <w:rFonts w:ascii="UD Digi Kyokasho NK-R" w:hAnsi="UD Digi Kyokasho NK-R" w:eastAsia="UD Digi Kyokasho NK-R" w:cs="UD Digi Kyokasho NK-R"/>
-                      <w:b w:val="0"/>
-                      <w:sz w:val="18"/>
-                    </w:rPr>
-                  </w:r>
-                </w:p>
-              </w:tc>
-              <w:tc>
-                <w:tcPr>
-                  <w:tcW w:type="dxa" w:w="1077"/>
+                  <w:tcW w:type="dxa" w:w="3005"/>
                 </w:tcPr>
                 <w:p>
                   <w:pPr>
@@ -1550,7 +1321,20 @@
                 <w:b w:val="0"/>
                 <w:sz w:val="21"/>
               </w:rPr>
-              <w:t>ⅱ　説得できた（できなかった）理由を、本文の言葉を使って説明しよう。</w:t>
+              <w:t>ⅱ 根拠と提案はどうつながるか説明する</w:t>
+            </w:r>
+          </w:p>
+          <w:p>
+            <w:pPr>
+              <w:spacing w:after="40" w:before="0" w:line="276" w:lineRule="auto"/>
+            </w:pPr>
+            <w:r>
+              <w:rPr>
+                <w:rFonts w:ascii="UD Digi Kyokasho NK-R" w:hAnsi="UD Digi Kyokasho NK-R" w:eastAsia="UD Digi Kyokasho NK-R" w:cs="UD Digi Kyokasho NK-R"/>
+                <w:b w:val="0"/>
+                <w:sz w:val="18"/>
+              </w:rPr>
+              <w:t>本文を短く引用し、相手の反論に応じて変えた言い方も書こう。</w:t>
             </w:r>
           </w:p>
           <w:tbl>
@@ -1644,7 +1428,20 @@
                 <w:b w:val="0"/>
                 <w:sz w:val="21"/>
               </w:rPr>
-              <w:t>ⅳ　AIの項王は、本文の項王と同じだったか。違うと感じたところと、その根拠を書こう。</w:t>
+              <w:t>ⅲ AIと本文の項王を比べる</w:t>
+            </w:r>
+          </w:p>
+          <w:p>
+            <w:pPr>
+              <w:spacing w:after="40" w:before="0" w:line="276" w:lineRule="auto"/>
+            </w:pPr>
+            <w:r>
+              <w:rPr>
+                <w:rFonts w:ascii="UD Digi Kyokasho NK-R" w:hAnsi="UD Digi Kyokasho NK-R" w:eastAsia="UD Digi Kyokasho NK-R" w:cs="UD Digi Kyokasho NK-R"/>
+                <w:b w:val="0"/>
+                <w:sz w:val="18"/>
+              </w:rPr>
+              <w:t>本文にある言動、そこからの解釈、AIの創作を分けて書こう。</w:t>
             </w:r>
           </w:p>
           <w:tbl>
@@ -1729,7 +1526,33 @@
                 <w:b w:val="0"/>
                 <w:sz w:val="21"/>
               </w:rPr>
-              <w:t>ⅲ　「項羽は一の范増有れども用ゐる能はず」。項羽が范増を用いることができなかったのはなぜか。鴻門之会の本文（玉玦・項荘の剣舞・豎子与に謀るに足らず）から考えよう。</w:t>
+              <w:t>ⅳ 対話後に後続の本文と比べる</w:t>
+            </w:r>
+          </w:p>
+          <w:p>
+            <w:pPr>
+              <w:spacing w:after="40" w:before="0" w:line="276" w:lineRule="auto"/>
+            </w:pPr>
+            <w:r>
+              <w:rPr>
+                <w:rFonts w:ascii="UD Digi Kyokasho NK-R" w:hAnsi="UD Digi Kyokasho NK-R" w:eastAsia="UD Digi Kyokasho NK-R" w:cs="UD Digi Kyokasho NK-R"/>
+                <w:b w:val="0"/>
+                <w:sz w:val="20"/>
+              </w:rPr>
+              <w:t>本文では沛公の退出後、項王はすでに陳平へ呼び戻しを命じている（g15）。これを説得成功の証拠にできないのはなぜだろう。</w:t>
+            </w:r>
+          </w:p>
+          <w:p>
+            <w:pPr>
+              <w:spacing w:after="40" w:before="0" w:line="276" w:lineRule="auto"/>
+            </w:pPr>
+            <w:r>
+              <w:rPr>
+                <w:rFonts w:ascii="UD Digi Kyokasho NK-R" w:hAnsi="UD Digi Kyokasho NK-R" w:eastAsia="UD Digi Kyokasho NK-R" w:cs="UD Digi Kyokasho NK-R"/>
+                <w:b w:val="0"/>
+                <w:sz w:val="20"/>
+              </w:rPr>
+              <w:t>高祖の評「項羽は一の范増有れども用ゐる能はず」は、後の勝者の評価でもある。玉玦への沈黙の理由を、一つに決めずに考えよう。</w:t>
             </w:r>
           </w:p>
           <w:tbl>
@@ -1848,7 +1671,20 @@
                 <w:color w:val="555555"/>
                 <w:sz w:val="18"/>
               </w:rPr>
-              <w:t>〈振り返り〉　□ 書き下し文を正確に引用できた　□ 項王の価値観を踏まえて言葉を選べた　□ AIの答えを本文で確かめた</w:t>
+              <w:t>振り返り　□ 段番号付きで引用した　□ 根拠と推論を分けた　□ AIの答えを本文で確かめた</w:t>
+            </w:r>
+          </w:p>
+          <w:p>
+            <w:pPr>
+              <w:spacing w:after="40" w:before="0" w:line="276" w:lineRule="auto"/>
+            </w:pPr>
+            <w:r>
+              <w:rPr>
+                <w:rFonts w:ascii="UD Digi Kyokasho NK-R" w:hAnsi="UD Digi Kyokasho NK-R" w:eastAsia="UD Digi Kyokasho NK-R" w:cs="UD Digi Kyokasho NK-R"/>
+                <w:b w:val="0"/>
+                <w:sz w:val="18"/>
+              </w:rPr>
+              <w:t>次に変えたい言い方や提案：</w:t>
             </w:r>
           </w:p>
           <w:p>

</xml_diff>